<commit_message>
Add contract form validation and date placeholders
This commit adds CPF and cargo input validation to the contract generator, fills the document date using the current local date in Portuguese, and replaces the new template placeholders in the Word file. It also fixes filename sanitization so spaces are normalized correctly when saving the generated contract.
</commit_message>
<xml_diff>
--- a/Automação/Contratos/modelo.docx
+++ b/Automação/Contratos/modelo.docx
@@ -162,7 +162,7 @@
           <w:b/>
           <w:bCs/>
         </w:rPr>
-        <w:t>EMPREGADO</w:t>
+        <w:t>{{CARGO}}</w:t>
       </w:r>
       <w:r>
         <w:t>.</w:t>
@@ -202,7 +202,7 @@
           <w:b/>
           <w:bCs/>
         </w:rPr>
-        <w:t>Desenvolvedor de Software Pleno</w:t>
+        <w:t>{{CARGO}}</w:t>
       </w:r>
       <w:r>
         <w:t>, devendo desempenhar as seguintes atividades principais:</w:t>
@@ -558,7 +558,14 @@
           <w:i/>
           <w:iCs/>
         </w:rPr>
-        <w:t>São Paulo, 28 de setembro de 2026.</w:t>
+        <w:t xml:space="preserve">São Paulo, </w:t>
+      </w:r>
+      <w:r>
+        <w:rPr>
+          <w:i/>
+          <w:iCs/>
+        </w:rPr>
+        <w:t>{{DATA}}</w:t>
       </w:r>
     </w:p>
     <w:p>
@@ -629,7 +636,7 @@
         <w:jc w:val="center"/>
       </w:pPr>
       <w:r>
-        <w:t>Empregado</w:t>
+        <w:t>{{CARGO}}</w:t>
       </w:r>
     </w:p>
     <w:p>

</xml_diff>